<commit_message>
add design spec and test plan
</commit_message>
<xml_diff>
--- a/spi/SPI_Design_Specification.docx
+++ b/spi/SPI_Design_Specification.docx
@@ -8,11 +8,6 @@
       </w:pPr>
       <w:r>
         <w:t>1. Interface</w:t>
-      </w:r>
-    </w:p>
-    <w:p>
-      <w:r>
-        <w:t>Figure 1: SPI Communication Module Block Diagram</w:t>
       </w:r>
     </w:p>
     <w:p>
@@ -329,7 +324,7 @@
           </w:tcPr>
           <w:p>
             <w:r>
-              <w:t>High when master is idle</w:t>
+              <w:t>High when master is in IDLE state</w:t>
             </w:r>
           </w:p>
         </w:tc>
@@ -371,7 +366,7 @@
           </w:tcPr>
           <w:p>
             <w:r>
-              <w:t>SPI clock (inverted ref_clk during transfer)</w:t>
+              <w:t>SPI clock (~ref_clk during TRANSFER, else 0)</w:t>
             </w:r>
           </w:p>
         </w:tc>
@@ -413,7 +408,7 @@
           </w:tcPr>
           <w:p>
             <w:r>
-              <w:t>Master Out Slave In</w:t>
+              <w:t>Master Out Slave In (= tx_reg[7])</w:t>
             </w:r>
           </w:p>
         </w:tc>
@@ -456,6 +451,48 @@
           <w:p>
             <w:r>
               <w:t>Master In Slave Out</w:t>
+            </w:r>
+          </w:p>
+        </w:tc>
+      </w:tr>
+      <w:tr>
+        <w:tc>
+          <w:tcPr>
+            <w:tcW w:type="dxa" w:w="2160"/>
+          </w:tcPr>
+          <w:p>
+            <w:r>
+              <w:t>ss[7:0]</w:t>
+            </w:r>
+          </w:p>
+        </w:tc>
+        <w:tc>
+          <w:tcPr>
+            <w:tcW w:type="dxa" w:w="2160"/>
+          </w:tcPr>
+          <w:p>
+            <w:r>
+              <w:t>8</w:t>
+            </w:r>
+          </w:p>
+        </w:tc>
+        <w:tc>
+          <w:tcPr>
+            <w:tcW w:type="dxa" w:w="2160"/>
+          </w:tcPr>
+          <w:p>
+            <w:r>
+              <w:t>Out</w:t>
+            </w:r>
+          </w:p>
+        </w:tc>
+        <w:tc>
+          <w:tcPr>
+            <w:tcW w:type="dxa" w:w="2160"/>
+          </w:tcPr>
+          <w:p>
+            <w:r>
+              <w:t>Slave select, one-cold (active during LOAD_SS and TRANSFER)</w:t>
             </w:r>
           </w:p>
         </w:tc>
@@ -687,7 +724,7 @@
           </w:tcPr>
           <w:p>
             <w:r>
-              <w:t>Active-low chip select</w:t>
+              <w:t>Active-low chip select (from master ss)</w:t>
             </w:r>
           </w:p>
         </w:tc>
@@ -860,6 +897,90 @@
           </w:p>
         </w:tc>
       </w:tr>
+      <w:tr>
+        <w:tc>
+          <w:tcPr>
+            <w:tcW w:type="dxa" w:w="2160"/>
+          </w:tcPr>
+          <w:p>
+            <w:r>
+              <w:t>load</w:t>
+            </w:r>
+          </w:p>
+        </w:tc>
+        <w:tc>
+          <w:tcPr>
+            <w:tcW w:type="dxa" w:w="2160"/>
+          </w:tcPr>
+          <w:p>
+            <w:r>
+              <w:t>1</w:t>
+            </w:r>
+          </w:p>
+        </w:tc>
+        <w:tc>
+          <w:tcPr>
+            <w:tcW w:type="dxa" w:w="2160"/>
+          </w:tcPr>
+          <w:p>
+            <w:r>
+              <w:t>In</w:t>
+            </w:r>
+          </w:p>
+        </w:tc>
+        <w:tc>
+          <w:tcPr>
+            <w:tcW w:type="dxa" w:w="2160"/>
+          </w:tcPr>
+          <w:p>
+            <w:r>
+              <w:t>Latch in -&gt; tx_load_reg (when cs=1)</w:t>
+            </w:r>
+          </w:p>
+        </w:tc>
+      </w:tr>
+      <w:tr>
+        <w:tc>
+          <w:tcPr>
+            <w:tcW w:type="dxa" w:w="2160"/>
+          </w:tcPr>
+          <w:p>
+            <w:r>
+              <w:t>ready</w:t>
+            </w:r>
+          </w:p>
+        </w:tc>
+        <w:tc>
+          <w:tcPr>
+            <w:tcW w:type="dxa" w:w="2160"/>
+          </w:tcPr>
+          <w:p>
+            <w:r>
+              <w:t>1</w:t>
+            </w:r>
+          </w:p>
+        </w:tc>
+        <w:tc>
+          <w:tcPr>
+            <w:tcW w:type="dxa" w:w="2160"/>
+          </w:tcPr>
+          <w:p>
+            <w:r>
+              <w:t>Out</w:t>
+            </w:r>
+          </w:p>
+        </w:tc>
+        <w:tc>
+          <w:tcPr>
+            <w:tcW w:type="dxa" w:w="2160"/>
+          </w:tcPr>
+          <w:p>
+            <w:r>
+              <w:t>High when slave is idle (= cs)</w:t>
+            </w:r>
+          </w:p>
+        </w:tc>
+      </w:tr>
     </w:tbl>
     <w:p>
       <w:pPr>
@@ -871,7 +992,7 @@
     </w:p>
     <w:p>
       <w:r>
-        <w:t>SPI Communication module with the following characteristics:</w:t>
+        <w:t>SPI Communication module characteristics:</w:t>
       </w:r>
     </w:p>
     <w:p>
@@ -887,7 +1008,7 @@
         <w:pStyle w:val="ListParagraph"/>
       </w:pPr>
       <w:r>
-        <w:t>SPI Mode: CPOL=0 (idle low), CPHA=0 variant. Master drives MOSI on posedge ref_clk, slave samples on negedge ref_clk (= posedge s_clk).</w:t>
+        <w:t>Clock polarity: s_clk idle LOW, inverted ref_clk during transfer.</w:t>
       </w:r>
     </w:p>
     <w:p>
@@ -895,7 +1016,15 @@
         <w:pStyle w:val="ListParagraph"/>
       </w:pPr>
       <w:r>
-        <w:t>Full-duplex: master sends and receives simultaneously.</w:t>
+        <w:t>Sampling: slave samples MOSI on posedge s_clk (= negedge ref_clk). Master samples MISO on negedge ref_clk (= posedge s_clk).</w:t>
+      </w:r>
+    </w:p>
+    <w:p>
+      <w:pPr>
+        <w:pStyle w:val="ListParagraph"/>
+      </w:pPr>
+      <w:r>
+        <w:t>Full-duplex: master sends and receives simultaneously in 8 clock cycles.</w:t>
       </w:r>
     </w:p>
     <w:p>
@@ -920,7 +1049,7 @@
         <w:pStyle w:val="NoSpacing"/>
       </w:pPr>
       <w:r>
-        <w:t>SPI Master CNTL Opcode:</w:t>
+        <w:t>Table 3: SPI Master CNTL Opcode</w:t>
       </w:r>
     </w:p>
     <w:tbl>
@@ -1016,7 +1145,7 @@
           </w:tcPr>
           <w:p>
             <w:r>
-              <w:t>Load in -&gt; slave_idx (IDLE only)</w:t>
+              <w:t>Load in -&gt; slave_idx (IDLE only). If idx &gt;= 8, ss stays 0xFF</w:t>
             </w:r>
           </w:p>
         </w:tc>
@@ -1038,7 +1167,7 @@
           </w:tcPr>
           <w:p>
             <w:r>
-              <w:t>Start transfer. Not ready until done and cntl != 11</w:t>
+              <w:t>Start transfer. Not ready until done AND cntl != 2'b11</w:t>
             </w:r>
           </w:p>
         </w:tc>
@@ -1063,7 +1192,7 @@
         <w:pStyle w:val="ListParagraph"/>
       </w:pPr>
       <w:r>
-        <w:t>cs=0: transaction active, shift on SCLK edges.</w:t>
+        <w:t>cs asserts (1-&gt;0): transaction begins. Slave drives miso, samples mosi on sclk edges.</w:t>
       </w:r>
     </w:p>
     <w:p>
@@ -1071,7 +1200,7 @@
         <w:pStyle w:val="ListParagraph"/>
       </w:pPr>
       <w:r>
-        <w:t>cs=1 after transaction: out holds received byte.</w:t>
+        <w:t>cs deasserts (0-&gt;1): transaction ends. out holds received byte.</w:t>
       </w:r>
     </w:p>
     <w:p>
@@ -1079,7 +1208,7 @@
         <w:pStyle w:val="ListParagraph"/>
       </w:pPr>
       <w:r>
-        <w:t>Slave must have tx_load_reg valid before master starts.</w:t>
+        <w:t>Slave must have tx_load_reg valid before master asserts cs.</w:t>
       </w:r>
     </w:p>
     <w:p>
@@ -1108,7 +1237,7 @@
         <w:pStyle w:val="ListParagraph"/>
       </w:pPr>
       <w:r>
-        <w:t>tx_reg[7:0]: TX shift register. Shift left, fill 0.</w:t>
+        <w:t>tx_reg[7:0]: TX shift register. Shift left, fill 0 each posedge ref_clk during TRANSFER.</w:t>
       </w:r>
     </w:p>
     <w:p>
@@ -1116,7 +1245,7 @@
         <w:pStyle w:val="ListParagraph"/>
       </w:pPr>
       <w:r>
-        <w:t>rx_reg[7:0]: RX shift register. Sample miso on negedge ref_clk.</w:t>
+        <w:t>rx_reg[7:0]: RX shift register. Sample miso each negedge ref_clk during TRANSFER.</w:t>
       </w:r>
     </w:p>
     <w:p>
@@ -1124,7 +1253,7 @@
         <w:pStyle w:val="ListParagraph"/>
       </w:pPr>
       <w:r>
-        <w:t>bit_cnt[2:0]: Bit counter 0-7 during TRANSFER.</w:t>
+        <w:t>bit_cnt[2:0]: Bit counter 0-7 during TRANSFER, reset otherwise.</w:t>
       </w:r>
     </w:p>
     <w:p>
@@ -1132,7 +1261,7 @@
         <w:pStyle w:val="ListParagraph"/>
       </w:pPr>
       <w:r>
-        <w:t>slave_idx[7:0]: Binary slave index. Reset = 0xFF.</w:t>
+        <w:t>slave_idx[7:0]: Binary slave index. Load via cntl=10. Reset = 0xFF (no slave).</w:t>
       </w:r>
     </w:p>
     <w:p/>
@@ -1162,7 +1291,7 @@
         <w:pStyle w:val="ListParagraph"/>
       </w:pPr>
       <w:r>
-        <w:t>ss = slave_onehot when LOAD_SS or TRANSFER, else 0xFF</w:t>
+        <w:t>ss = ~(1 &lt;&lt; slave_idx[2:0]) when (LOAD_SS or TRANSFER) and slave_idx &lt; 8, else 0xFF</w:t>
       </w:r>
     </w:p>
     <w:p>
@@ -1175,6 +1304,14 @@
     </w:p>
     <w:p>
       <w:pPr>
+        <w:pStyle w:val="ListParagraph"/>
+      </w:pPr>
+      <w:r>
+        <w:t>ready = (state == IDLE)</w:t>
+      </w:r>
+    </w:p>
+    <w:p>
+      <w:pPr>
         <w:pStyle w:val="Heading2"/>
       </w:pPr>
       <w:r>
@@ -1183,7 +1320,7 @@
     </w:p>
     <w:p>
       <w:r>
-        <w:t>States: IDLE -&gt; LOAD_SS -&gt; TRANSFER -&gt; WAIT_CLEAR -&gt; IDLE</w:t>
+        <w:t>IDLE -&gt; LOAD_SS -&gt; TRANSFER -&gt; WAIT_CLEAR -&gt; IDLE</w:t>
       </w:r>
     </w:p>
     <w:p/>
@@ -1215,7 +1352,7 @@
           </w:tcPr>
           <w:p>
             <w:r>
-              <w:t>Condition to next</w:t>
+              <w:t>Transition condition</w:t>
             </w:r>
           </w:p>
         </w:tc>
@@ -1247,7 +1384,7 @@
           </w:tcPr>
           <w:p>
             <w:r>
-              <w:t>cntl == 11</w:t>
+              <w:t>cntl == 2'b11</w:t>
             </w:r>
           </w:p>
         </w:tc>
@@ -1257,7 +1394,7 @@
           </w:tcPr>
           <w:p>
             <w:r>
-              <w:t>Ready, accept load commands</w:t>
+              <w:t>Accept load commands, ready=1</w:t>
             </w:r>
           </w:p>
         </w:tc>
@@ -1279,7 +1416,7 @@
           </w:tcPr>
           <w:p>
             <w:r>
-              <w:t>unconditional (1 cycle)</w:t>
+              <w:t>Unconditional (1 cycle)</w:t>
             </w:r>
           </w:p>
         </w:tc>
@@ -1289,7 +1426,7 @@
           </w:tcPr>
           <w:p>
             <w:r>
-              <w:t>Assert ss, setup time for slave</w:t>
+              <w:t>Assert ss one cycle before s_clk starts</w:t>
             </w:r>
           </w:p>
         </w:tc>
@@ -1321,7 +1458,7 @@
           </w:tcPr>
           <w:p>
             <w:r>
-              <w:t>Shift 8 bits, s_clk active</w:t>
+              <w:t>Shift 8 bits, s_clk = ~ref_clk</w:t>
             </w:r>
           </w:p>
         </w:tc>
@@ -1343,7 +1480,7 @@
           </w:tcPr>
           <w:p>
             <w:r>
-              <w:t>cntl == 00</w:t>
+              <w:t>cntl == 2'b00</w:t>
             </w:r>
           </w:p>
         </w:tc>
@@ -1353,7 +1490,7 @@
           </w:tcPr>
           <w:p>
             <w:r>
-              <w:t>Anti-retrigger guard</w:t>
+              <w:t>Hold until host releases cntl, prevents retrigger</w:t>
             </w:r>
           </w:p>
         </w:tc>
@@ -1377,7 +1514,7 @@
         <w:pStyle w:val="ListParagraph"/>
       </w:pPr>
       <w:r>
-        <w:t>tx_load_reg[7:0]: Holding register. Latched from in on posedge clk when cs=1 and load=1.</w:t>
+        <w:t>tx_load_reg[7:0]: Holding register. Latched on posedge clk when cs=1 and load=1.</w:t>
       </w:r>
     </w:p>
     <w:p>
@@ -1385,7 +1522,7 @@
         <w:pStyle w:val="ListParagraph"/>
       </w:pPr>
       <w:r>
-        <w:t>tx_shift_reg[7:0]: TX shift register. Clocked by negedge sclk. Reset by posedge cs.</w:t>
+        <w:t>tx_shift_reg[7:0]: TX shift register. Clocked by negedge sclk. Reloaded on posedge cs (deassert).</w:t>
       </w:r>
     </w:p>
     <w:p>
@@ -1393,7 +1530,7 @@
         <w:pStyle w:val="ListParagraph"/>
       </w:pPr>
       <w:r>
-        <w:t>rx_reg[7:0]: RX shift register. Clocked by posedge sclk.</w:t>
+        <w:t>rx_reg[7:0]: RX shift register. Clocked by posedge sclk when cs=0.</w:t>
       </w:r>
     </w:p>
     <w:p>
@@ -1401,13 +1538,13 @@
         <w:pStyle w:val="ListParagraph"/>
       </w:pPr>
       <w:r>
-        <w:t>first_bit: 1-bit flag. Set by posedge cs, cleared by first negedge sclk.</w:t>
+        <w:t>first_bit: 1-bit flag. Set on posedge cs, cleared on first negedge sclk after cs asserts.</w:t>
       </w:r>
     </w:p>
     <w:p/>
     <w:p>
       <w:r>
-        <w:t>MISO mux logic:</w:t>
+        <w:t>MISO output mux:</w:t>
       </w:r>
     </w:p>
     <w:p>
@@ -1423,7 +1560,7 @@
         <w:pStyle w:val="ListParagraph"/>
       </w:pPr>
       <w:r>
-        <w:t>first_bit=1: miso = tx_load_reg[7] (look-ahead, before shift register loads)</w:t>
+        <w:t>cs=0, first_bit=1: miso = tx_load_reg[7] (look-ahead for first bit)</w:t>
       </w:r>
     </w:p>
     <w:p>
@@ -1431,7 +1568,7 @@
         <w:pStyle w:val="ListParagraph"/>
       </w:pPr>
       <w:r>
-        <w:t>first_bit=0: miso = tx_shift_reg[7]</w:t>
+        <w:t>cs=0, first_bit=0: miso = tx_shift_reg[7]</w:t>
       </w:r>
     </w:p>
     <w:p>

</xml_diff>